<commit_message>
Lito Sousa: revisão crítica da Parte 5
Co-Authored-By: Claude Opus 5.5 <noreply@anthropic.com>
Claude-Session: https://claude.ai/code/session_01MJjUEEZrxQDEUifKK2vj9g
</commit_message>
<xml_diff>
--- a/roteiros/lito-sousa/LitoSousa_Parte5.docx
+++ b/roteiros/lito-sousa/LitoSousa_Parte5.docx
@@ -95,7 +95,7 @@
         <w:rPr>
           <w:color w:val="C00000"/>
         </w:rPr>
-        <w:t>A última vez em que Lito tinha aparecido de verdade diante de uma câmera foi em quatro de setembro. E a distância entre aquele vídeo e este é a parte mais dolorosa de toda essa história.</w:t>
+        <w:t>A última aparição confirmada do Lito real tinha sido em quatro de setembro. E a distância entre aquele vídeo e este é a parte mais dolorosa de toda essa história.</w:t>
       </w:r>
     </w:p>
     <w:p>
@@ -111,7 +111,7 @@
         <w:rPr>
           <w:color w:val="1F4EB4"/>
         </w:rPr>
-        <w:t>Nas imagens daquele dia, aparecia o Lito real. A fala lenta. O corpo com espasmos.</w:t>
+        <w:t>Naquele dia, o Lito real tinha aparecido com a fala lenta e o corpo tomado por espasmos.</w:t>
       </w:r>
     </w:p>
     <w:p>
@@ -151,7 +151,7 @@
         <w:rPr>
           <w:color w:val="1F4EB4"/>
         </w:rPr>
-        <w:t>O homem que passou a vida explicando ao Brasil a verdade sobre cada queda de avião tinha virado, ele mesmo, uma imagem fabricada.</w:t>
+        <w:t>O homem que passou a vida explicando ao Brasil a verdade sobre cada queda de avião agora aparecia para o público numa imagem fabricada.</w:t>
       </w:r>
     </w:p>
     <w:p>
@@ -167,7 +167,7 @@
         <w:rPr>
           <w:color w:val="1F4EB4"/>
         </w:rPr>
-        <w:t>Metade dessa promessa se cumpriu. Lito foi, de fato, o primeiro ser humano do mundo a receber aquele remédio contra a doença de Creutzfeldt-Jakob.</w:t>
+        <w:t>Uma parte dessa frase virou realidade. Lito foi, de fato, o primeiro ser humano do mundo a receber aquele remédio contra a doença de Creutzfeldt-Jakob.</w:t>
       </w:r>
     </w:p>
     <w:p>
@@ -175,7 +175,7 @@
         <w:rPr>
           <w:color w:val="1F4EB4"/>
         </w:rPr>
-        <w:t>A outra metade ainda não tem resposta. Até o fim de setembro, segundo a própria Mila, não havia nenhuma melhora.</w:t>
+        <w:t>A outra parte, a de controlar a doença, ainda não tem resposta. Até o fim de setembro, segundo a própria Mila, não havia nenhuma melhora.</w:t>
       </w:r>
     </w:p>
     <w:p>
@@ -183,7 +183,7 @@
         <w:rPr>
           <w:color w:val="1F4EB4"/>
         </w:rPr>
-        <w:t>No meio desse silêncio, o vídeo com inteligência artificial mostrou ao público exatamente o que todo mundo queria ver. Um Lito curado, que só existe na tela.</w:t>
+        <w:t>No meio desse silêncio, o vídeo com inteligência artificial mostrou ao público exatamente o que todo mundo queria ver. Um Lito saudável, falando de aviões como antes.</w:t>
       </w:r>
     </w:p>
     <w:p>
@@ -191,7 +191,7 @@
         <w:rPr>
           <w:color w:val="000000"/>
         </w:rPr>
-        <w:t>A reação dividiu o Brasil.</w:t>
+        <w:t>A reação dividiu os fãs.</w:t>
       </w:r>
     </w:p>
     <w:p>
@@ -271,7 +271,7 @@
         <w:rPr>
           <w:color w:val="000000"/>
         </w:rPr>
-        <w:t>Por fim, o vídeo feito por uma máquina, com um Lito que fala sem esforço, enquanto o Lito real fala devagar.</w:t>
+        <w:t>Por fim, o vídeo feito por uma máquina, com um Lito que fala sem esforço, enquanto o Lito real enfrenta a doença longe das câmeras.</w:t>
       </w:r>
     </w:p>
     <w:p>
@@ -295,7 +295,7 @@
         <w:rPr>
           <w:color w:val="000000"/>
         </w:rPr>
-        <w:t>Lito Sousa está vivo. Lúcido, segundo a família. E cercado por uma mulher que vendeu o carro, enfrentou ataques e desmentiu boatos para proteger o tempo que os dois ainda têm juntos.</w:t>
+        <w:t>Lito Sousa está vivo e segue em tratamento. Ao lado dele está uma mulher que vendeu o carro, enfrentou ataques e desmentiu boatos para proteger o marido.</w:t>
       </w:r>
     </w:p>
     <w:p>
@@ -335,7 +335,7 @@
         <w:rPr>
           <w:color w:val="000000"/>
         </w:rPr>
-        <w:t>Lito passou a vida ensinando que uma tragédia quase sempre começa com um sinal pequeno, que alguém ignorou. Em julho, quando decidiu contar ao país sobre o câncer, ele fez um último pedido aos seguidores.</w:t>
+        <w:t>Lito passou a vida ensinando que uma tragédia quase sempre começa com um sinal pequeno. E que, quanto mais cedo esse sinal aparece, maior a chance de evitar o pior. Em julho, quando decidiu contar ao país sobre o câncer, ele fez um pedido aos seguidores.</w:t>
       </w:r>
     </w:p>
     <w:p>

</xml_diff>